<commit_message>
Added state pattern implementation
</commit_message>
<xml_diff>
--- a/Design_Patterns/design patterns.docx
+++ b/Design_Patterns/design patterns.docx
@@ -505,6 +505,9 @@
     </w:p>
     <w:p>
       <w:r>
+        <w:rPr>
+          <w:noProof/>
+        </w:rPr>
         <w:drawing>
           <wp:inline distT="0" distB="0" distL="0" distR="0" wp14:anchorId="4854283C" wp14:editId="78081D13">
             <wp:extent cx="1866900" cy="3149839"/>
@@ -750,6 +753,9 @@
         </mc:AlternateContent>
       </w:r>
       <w:r>
+        <w:rPr>
+          <w:noProof/>
+        </w:rPr>
         <w:drawing>
           <wp:inline distT="0" distB="0" distL="0" distR="0" wp14:anchorId="25127D20" wp14:editId="5156F643">
             <wp:extent cx="2301439" cy="777307"/>
@@ -867,6 +873,7 @@
         <w:rPr>
           <w:b/>
           <w:bCs/>
+          <w:noProof/>
         </w:rPr>
         <w:drawing>
           <wp:inline distT="0" distB="0" distL="0" distR="0" wp14:anchorId="1508FC42" wp14:editId="248FDF90">
@@ -1325,44 +1332,176 @@
           <w:bCs/>
         </w:rPr>
       </w:pPr>
-    </w:p>
-    <w:p>
-      <w:pPr>
-        <w:rPr>
-          <w:b/>
-          <w:bCs/>
-        </w:rPr>
-      </w:pPr>
-    </w:p>
-    <w:p>
-      <w:pPr>
-        <w:rPr>
-          <w:b/>
-          <w:bCs/>
-        </w:rPr>
-      </w:pPr>
-    </w:p>
-    <w:p>
-      <w:pPr>
-        <w:rPr>
-          <w:b/>
-          <w:bCs/>
-        </w:rPr>
-      </w:pPr>
-    </w:p>
-    <w:p>
-      <w:pPr>
-        <w:rPr>
-          <w:b/>
-          <w:bCs/>
-        </w:rPr>
-      </w:pPr>
-      <w:r>
-        <w:rPr>
-          <w:b/>
-          <w:bCs/>
-        </w:rPr>
-        <w:t>Builder</w:t>
+      <w:r>
+        <w:rPr>
+          <w:b/>
+          <w:bCs/>
+        </w:rPr>
+        <w:lastRenderedPageBreak/>
+        <w:t>State pattern –</w:t>
+      </w:r>
+    </w:p>
+    <w:p>
+      <w:r>
+        <w:t xml:space="preserve">The State Pattern is a </w:t>
+      </w:r>
+      <w:proofErr w:type="spellStart"/>
+      <w:r>
+        <w:t>behavioral</w:t>
+      </w:r>
+      <w:proofErr w:type="spellEnd"/>
+      <w:r>
+        <w:t xml:space="preserve"> design pattern that allows an object to change its </w:t>
+      </w:r>
+      <w:proofErr w:type="spellStart"/>
+      <w:r>
+        <w:t>behavior</w:t>
+      </w:r>
+      <w:proofErr w:type="spellEnd"/>
+      <w:r>
+        <w:t xml:space="preserve"> when its internal state changes.</w:t>
+      </w:r>
+    </w:p>
+    <w:p>
+      <w:r>
+        <w:t>Instead of writing lots of if-else or switch statements, each state is represented by a separate class.</w:t>
+      </w:r>
+    </w:p>
+    <w:p>
+      <w:pPr>
+        <w:rPr>
+          <w:b/>
+          <w:bCs/>
+        </w:rPr>
+      </w:pPr>
+    </w:p>
+    <w:p>
+      <w:r>
+        <w:t>Suppose for an ATM, there can be different states</w:t>
+      </w:r>
+    </w:p>
+    <w:p>
+      <w:proofErr w:type="spellStart"/>
+      <w:r>
+        <w:t>NoCardState</w:t>
+      </w:r>
+      <w:proofErr w:type="spellEnd"/>
+    </w:p>
+    <w:p>
+      <w:proofErr w:type="spellStart"/>
+      <w:r>
+        <w:t>HasCardState</w:t>
+      </w:r>
+      <w:proofErr w:type="spellEnd"/>
+    </w:p>
+    <w:p>
+      <w:proofErr w:type="spellStart"/>
+      <w:r>
+        <w:t>PinVerifiedState</w:t>
+      </w:r>
+      <w:proofErr w:type="spellEnd"/>
+    </w:p>
+    <w:p>
+      <w:proofErr w:type="spellStart"/>
+      <w:r>
+        <w:t>CashDispensedState</w:t>
+      </w:r>
+      <w:proofErr w:type="spellEnd"/>
+    </w:p>
+    <w:p/>
+    <w:p>
+      <w:r>
+        <w:t>No Card Inserted</w:t>
+      </w:r>
+    </w:p>
+    <w:p>
+      <w:r>
+        <w:t xml:space="preserve">    ↓</w:t>
+      </w:r>
+    </w:p>
+    <w:p>
+      <w:r>
+        <w:t>Insert Card</w:t>
+      </w:r>
+    </w:p>
+    <w:p>
+      <w:r>
+        <w:t xml:space="preserve">    ↓</w:t>
+      </w:r>
+    </w:p>
+    <w:p>
+      <w:r>
+        <w:t>Has Card</w:t>
+      </w:r>
+    </w:p>
+    <w:p>
+      <w:r>
+        <w:t xml:space="preserve">    ↓</w:t>
+      </w:r>
+    </w:p>
+    <w:p>
+      <w:r>
+        <w:t>Enter PIN</w:t>
+      </w:r>
+    </w:p>
+    <w:p>
+      <w:r>
+        <w:t xml:space="preserve">    ↓</w:t>
+      </w:r>
+    </w:p>
+    <w:p>
+      <w:r>
+        <w:t>PIN Verified</w:t>
+      </w:r>
+    </w:p>
+    <w:p>
+      <w:r>
+        <w:t xml:space="preserve">    ↓</w:t>
+      </w:r>
+    </w:p>
+    <w:p>
+      <w:r>
+        <w:t>Withdraw Cash</w:t>
+      </w:r>
+    </w:p>
+    <w:p>
+      <w:r>
+        <w:lastRenderedPageBreak/>
+        <w:drawing>
+          <wp:inline distT="0" distB="0" distL="0" distR="0" wp14:anchorId="7EFEB354" wp14:editId="0C3291CF">
+            <wp:extent cx="3406435" cy="4351397"/>
+            <wp:effectExtent l="0" t="0" r="3810" b="0"/>
+            <wp:docPr id="472526242" name="Picture 1"/>
+            <wp:cNvGraphicFramePr>
+              <a:graphicFrameLocks xmlns:a="http://schemas.openxmlformats.org/drawingml/2006/main" noChangeAspect="1"/>
+            </wp:cNvGraphicFramePr>
+            <a:graphic xmlns:a="http://schemas.openxmlformats.org/drawingml/2006/main">
+              <a:graphicData uri="http://schemas.openxmlformats.org/drawingml/2006/picture">
+                <pic:pic xmlns:pic="http://schemas.openxmlformats.org/drawingml/2006/picture">
+                  <pic:nvPicPr>
+                    <pic:cNvPr id="472526242" name=""/>
+                    <pic:cNvPicPr/>
+                  </pic:nvPicPr>
+                  <pic:blipFill>
+                    <a:blip r:embed="rId15"/>
+                    <a:stretch>
+                      <a:fillRect/>
+                    </a:stretch>
+                  </pic:blipFill>
+                  <pic:spPr>
+                    <a:xfrm>
+                      <a:off x="0" y="0"/>
+                      <a:ext cx="3406435" cy="4351397"/>
+                    </a:xfrm>
+                    <a:prstGeom prst="rect">
+                      <a:avLst/>
+                    </a:prstGeom>
+                  </pic:spPr>
+                </pic:pic>
+              </a:graphicData>
+            </a:graphic>
+          </wp:inline>
+        </w:drawing>
       </w:r>
     </w:p>
     <w:p/>

</xml_diff>